<commit_message>
[Dev] reparto sprint 2
</commit_message>
<xml_diff>
--- a/docs/sprints/Ficha-Sprint-2.docx
+++ b/docs/sprints/Ficha-Sprint-2.docx
@@ -1,6 +1,6 @@
 
 <file path=word/document.xml><?xml version="1.0" encoding="utf-8"?>
-<w:document xmlns:wpc="http://schemas.microsoft.com/office/word/2010/wordprocessingCanvas" xmlns:cx="http://schemas.microsoft.com/office/drawing/2014/chartex" xmlns:cx1="http://schemas.microsoft.com/office/drawing/2015/9/8/chartex" xmlns:cx2="http://schemas.microsoft.com/office/drawing/2015/10/21/chartex" xmlns:cx3="http://schemas.microsoft.com/office/drawing/2016/5/9/chartex" xmlns:cx4="http://schemas.microsoft.com/office/drawing/2016/5/10/chartex" xmlns:cx5="http://schemas.microsoft.com/office/drawing/2016/5/11/chartex" xmlns:cx6="http://schemas.microsoft.com/office/drawing/2016/5/12/chartex" xmlns:cx7="http://schemas.microsoft.com/office/drawing/2016/5/13/chartex" xmlns:cx8="http://schemas.microsoft.com/office/drawing/2016/5/14/chartex" xmlns:mc="http://schemas.openxmlformats.org/markup-compatibility/2006" xmlns:aink="http://schemas.microsoft.com/office/drawing/2016/ink" xmlns:am3d="http://schemas.microsoft.com/office/drawing/2017/model3d" xmlns:o="urn:schemas-microsoft-com:office:office" xmlns:oel="http://schemas.microsoft.com/office/2019/extlst" xmlns:r="http://schemas.openxmlformats.org/officeDocument/2006/relationships" xmlns:m="http://schemas.openxmlformats.org/officeDocument/2006/math" xmlns:v="urn:schemas-microsoft-com:vml" xmlns:wp14="http://schemas.microsoft.com/office/word/2010/wordprocessingDrawing" xmlns:wp="http://schemas.openxmlformats.org/drawingml/2006/wordprocessingDrawing" xmlns:w10="urn:schemas-microsoft-com:office:word" xmlns:w="http://schemas.openxmlformats.org/wordprocessingml/2006/main" xmlns:w14="http://schemas.microsoft.com/office/word/2010/wordml" xmlns:w15="http://schemas.microsoft.com/office/word/2012/wordml" xmlns:w16cei="http://schemas.microsoft.com/office/word/2026/wordml/cei" xmlns:w16cex="http://schemas.microsoft.com/office/word/2018/wordml/cex" xmlns:w16cid="http://schemas.microsoft.com/office/word/2016/wordml/cid" xmlns:w16="http://schemas.microsoft.com/office/word/2018/wordml" xmlns:w16du="http://schemas.microsoft.com/office/word/2023/wordml/word16du" xmlns:w16sdtdh="http://schemas.microsoft.com/office/word/2020/wordml/sdtdatahash" xmlns:w16sdtfl="http://schemas.microsoft.com/office/word/2024/wordml/sdtformatlock" xmlns:w16se="http://schemas.microsoft.com/office/word/2015/wordml/symex" xmlns:wpg="http://schemas.microsoft.com/office/word/2010/wordprocessingGroup" xmlns:wpi="http://schemas.microsoft.com/office/word/2010/wordprocessingInk" xmlns:wne="http://schemas.microsoft.com/office/word/2006/wordml" xmlns:wps="http://schemas.microsoft.com/office/word/2010/wordprocessingShape" mc:Ignorable="w14 w15 w16se w16cid w16 w16cex w16sdtdh w16sdtfl w16du wp14">
+<w:document xmlns:wpc="http://schemas.microsoft.com/office/word/2010/wordprocessingCanvas" xmlns:cx="http://schemas.microsoft.com/office/drawing/2014/chartex" xmlns:cx1="http://schemas.microsoft.com/office/drawing/2015/9/8/chartex" xmlns:cx2="http://schemas.microsoft.com/office/drawing/2015/10/21/chartex" xmlns:cx3="http://schemas.microsoft.com/office/drawing/2016/5/9/chartex" xmlns:cx4="http://schemas.microsoft.com/office/drawing/2016/5/10/chartex" xmlns:cx5="http://schemas.microsoft.com/office/drawing/2016/5/11/chartex" xmlns:cx6="http://schemas.microsoft.com/office/drawing/2016/5/12/chartex" xmlns:cx7="http://schemas.microsoft.com/office/drawing/2016/5/13/chartex" xmlns:cx8="http://schemas.microsoft.com/office/drawing/2016/5/14/chartex" xmlns:mc="http://schemas.openxmlformats.org/markup-compatibility/2006" xmlns:aink="http://schemas.microsoft.com/office/drawing/2016/ink" xmlns:am3d="http://schemas.microsoft.com/office/drawing/2017/model3d" xmlns:o="urn:schemas-microsoft-com:office:office" xmlns:oel="http://schemas.microsoft.com/office/2019/extlst" xmlns:r="http://schemas.openxmlformats.org/officeDocument/2006/relationships" xmlns:m="http://schemas.openxmlformats.org/officeDocument/2006/math" xmlns:v="urn:schemas-microsoft-com:vml" xmlns:wp14="http://schemas.microsoft.com/office/word/2010/wordprocessingDrawing" xmlns:wp="http://schemas.openxmlformats.org/drawingml/2006/wordprocessingDrawing" xmlns:w10="urn:schemas-microsoft-com:office:word" xmlns:w="http://schemas.openxmlformats.org/wordprocessingml/2006/main" xmlns:w14="http://schemas.microsoft.com/office/word/2010/wordml" xmlns:w15="http://schemas.microsoft.com/office/word/2012/wordml" xmlns:w16cex="http://schemas.microsoft.com/office/word/2018/wordml/cex" xmlns:w16cid="http://schemas.microsoft.com/office/word/2016/wordml/cid" xmlns:w16="http://schemas.microsoft.com/office/word/2018/wordml" xmlns:w16du="http://schemas.microsoft.com/office/word/2023/wordml/word16du" xmlns:w16sdtdh="http://schemas.microsoft.com/office/word/2020/wordml/sdtdatahash" xmlns:w16sdtfl="http://schemas.microsoft.com/office/word/2024/wordml/sdtformatlock" xmlns:w16se="http://schemas.microsoft.com/office/word/2015/wordml/symex" xmlns:wpg="http://schemas.microsoft.com/office/word/2010/wordprocessingGroup" xmlns:wpi="http://schemas.microsoft.com/office/word/2010/wordprocessingInk" xmlns:wne="http://schemas.microsoft.com/office/word/2006/wordml" xmlns:wps="http://schemas.microsoft.com/office/word/2010/wordprocessingShape" mc:Ignorable="w14 w15 w16se w16cid w16 w16cex w16sdtdh w16sdtfl w16du wp14">
   <w:background w:color="FFFFFF"/>
   <w:body>
     <w:p>
@@ -99,7 +99,21 @@
                 <w:sz w:val="20"/>
                 <w:szCs w:val="20"/>
               </w:rPr>
-              <w:t xml:space="preserve"> - </w:t>
+              <w:t xml:space="preserve"> </w:t>
+            </w:r>
+            <w:r>
+              <w:rPr>
+                <w:sz w:val="20"/>
+                <w:szCs w:val="20"/>
+              </w:rPr>
+              <w:t>–</w:t>
+            </w:r>
+            <w:r>
+              <w:rPr>
+                <w:sz w:val="20"/>
+                <w:szCs w:val="20"/>
+              </w:rPr>
+              <w:t xml:space="preserve"> </w:t>
             </w:r>
             <w:r>
               <w:rPr>
@@ -387,22 +401,725 @@
         </w:rPr>
       </w:pPr>
       <w:r>
+        <w:rPr>
+          <w:sz w:val="20"/>
+          <w:szCs w:val="20"/>
+          <w:lang w:val="es-419"/>
+        </w:rPr>
         <w:t>Dejar el ciclo de vida del pedido demostrable en celular.</w:t>
+      </w:r>
+      <w:r>
+        <w:rPr>
+          <w:sz w:val="20"/>
+          <w:szCs w:val="20"/>
+          <w:lang w:val="es-419"/>
+        </w:rPr>
         <w:br/>
         <w:t>Un administrador consulta pedidos y avanza su estado (pendiente a entregado), dejando historial con fecha y hora.</w:t>
+      </w:r>
+      <w:r>
+        <w:rPr>
+          <w:sz w:val="20"/>
+          <w:szCs w:val="20"/>
+          <w:lang w:val="es-419"/>
+        </w:rPr>
         <w:br/>
         <w:t>Un cliente consulta el seguimiento (sucursal, estado, timeline, ETA), cancela si aplica, ve el historial y puede repetir un pedido.</w:t>
       </w:r>
+      <w:r>
+        <w:rPr>
+          <w:sz w:val="20"/>
+          <w:szCs w:val="20"/>
+          <w:lang w:val="es-419"/>
+        </w:rPr>
+        <w:br/>
+        <w:t>Resolver las mejoras del sprint1.</w:t>
+      </w:r>
     </w:p>
     <w:p>
       <w:pPr>
-        <w:rPr>
-          <w:sz w:val="20"/>
-          <w:szCs w:val="20"/>
-          <w:lang w:val="es-419"/>
-        </w:rPr>
-      </w:pPr>
-      <w:r/>
+        <w:pStyle w:val="Ttulo3"/>
+        <w:rPr>
+          <w:sz w:val="20"/>
+          <w:szCs w:val="20"/>
+          <w:u w:val="single"/>
+          <w:lang w:val="es-419"/>
+        </w:rPr>
+      </w:pPr>
+      <w:r>
+        <w:rPr>
+          <w:sz w:val="20"/>
+          <w:szCs w:val="20"/>
+          <w:u w:val="single"/>
+          <w:lang w:val="es-419"/>
+        </w:rPr>
+        <w:t>Devolución</w:t>
+      </w:r>
+      <w:r>
+        <w:rPr>
+          <w:sz w:val="20"/>
+          <w:szCs w:val="20"/>
+          <w:u w:val="single"/>
+          <w:lang w:val="es-419"/>
+        </w:rPr>
+        <w:t xml:space="preserve"> del sprint1</w:t>
+      </w:r>
+      <w:r>
+        <w:rPr>
+          <w:sz w:val="20"/>
+          <w:szCs w:val="20"/>
+          <w:u w:val="single"/>
+          <w:lang w:val="es-419"/>
+        </w:rPr>
+        <w:t>:</w:t>
+      </w:r>
+      <w:r>
+        <w:rPr>
+          <w:sz w:val="20"/>
+          <w:szCs w:val="20"/>
+          <w:u w:val="single"/>
+          <w:lang w:val="es-419"/>
+        </w:rPr>
+        <w:br/>
+      </w:r>
+    </w:p>
+    <w:p>
+      <w:pPr>
+        <w:pStyle w:val="Prrafodelista"/>
+        <w:numPr>
+          <w:ilvl w:val="0"/>
+          <w:numId w:val="1"/>
+        </w:numPr>
+        <w:rPr>
+          <w:sz w:val="20"/>
+          <w:szCs w:val="20"/>
+          <w:lang w:val="es-419"/>
+        </w:rPr>
+      </w:pPr>
+      <w:r>
+        <w:rPr>
+          <w:sz w:val="20"/>
+          <w:szCs w:val="20"/>
+          <w:lang w:val="es-419"/>
+        </w:rPr>
+        <w:t xml:space="preserve">Resolver </w:t>
+      </w:r>
+      <w:proofErr w:type="spellStart"/>
+      <w:r>
+        <w:rPr>
+          <w:sz w:val="20"/>
+          <w:szCs w:val="20"/>
+          <w:lang w:val="es-419"/>
+        </w:rPr>
+        <w:t>responsividad</w:t>
+      </w:r>
+      <w:proofErr w:type="spellEnd"/>
+      <w:r>
+        <w:rPr>
+          <w:sz w:val="20"/>
+          <w:szCs w:val="20"/>
+          <w:lang w:val="es-419"/>
+        </w:rPr>
+        <w:t xml:space="preserve"> en la </w:t>
+      </w:r>
+      <w:proofErr w:type="gramStart"/>
+      <w:r>
+        <w:rPr>
+          <w:sz w:val="20"/>
+          <w:szCs w:val="20"/>
+          <w:lang w:val="es-419"/>
+        </w:rPr>
+        <w:t>app</w:t>
+      </w:r>
+      <w:proofErr w:type="gramEnd"/>
+      <w:r>
+        <w:rPr>
+          <w:sz w:val="20"/>
+          <w:szCs w:val="20"/>
+          <w:lang w:val="es-419"/>
+        </w:rPr>
+        <w:t xml:space="preserve"> administrativa</w:t>
+      </w:r>
+      <w:r>
+        <w:rPr>
+          <w:sz w:val="20"/>
+          <w:szCs w:val="20"/>
+          <w:lang w:val="es-419"/>
+        </w:rPr>
+        <w:t>.</w:t>
+      </w:r>
+      <w:r>
+        <w:rPr>
+          <w:sz w:val="20"/>
+          <w:szCs w:val="20"/>
+          <w:lang w:val="es-419"/>
+        </w:rPr>
+        <w:t xml:space="preserve"> Cambiaria el menú.</w:t>
+      </w:r>
+    </w:p>
+    <w:p>
+      <w:pPr>
+        <w:pStyle w:val="Prrafodelista"/>
+        <w:numPr>
+          <w:ilvl w:val="0"/>
+          <w:numId w:val="1"/>
+        </w:numPr>
+        <w:rPr>
+          <w:sz w:val="20"/>
+          <w:szCs w:val="20"/>
+          <w:lang w:val="es-419"/>
+        </w:rPr>
+      </w:pPr>
+      <w:r>
+        <w:rPr>
+          <w:sz w:val="20"/>
+          <w:szCs w:val="20"/>
+          <w:lang w:val="es-419"/>
+        </w:rPr>
+        <w:t>Resolver latitud y longitud.</w:t>
+      </w:r>
+      <w:r>
+        <w:rPr>
+          <w:sz w:val="20"/>
+          <w:szCs w:val="20"/>
+          <w:lang w:val="es-419"/>
+        </w:rPr>
+        <w:t xml:space="preserve"> Pedir permiso para obtener los datos.</w:t>
+      </w:r>
+    </w:p>
+    <w:p>
+      <w:pPr>
+        <w:pStyle w:val="Prrafodelista"/>
+        <w:numPr>
+          <w:ilvl w:val="0"/>
+          <w:numId w:val="1"/>
+        </w:numPr>
+        <w:rPr>
+          <w:sz w:val="20"/>
+          <w:szCs w:val="20"/>
+          <w:lang w:val="es-419"/>
+        </w:rPr>
+      </w:pPr>
+      <w:r>
+        <w:rPr>
+          <w:sz w:val="20"/>
+          <w:szCs w:val="20"/>
+          <w:lang w:val="es-419"/>
+        </w:rPr>
+        <w:t>Mejorar diseño de las direcciones</w:t>
+      </w:r>
+      <w:r>
+        <w:rPr>
+          <w:sz w:val="20"/>
+          <w:szCs w:val="20"/>
+          <w:lang w:val="es-419"/>
+        </w:rPr>
+        <w:t>.</w:t>
+      </w:r>
+    </w:p>
+    <w:p>
+      <w:pPr>
+        <w:pStyle w:val="Prrafodelista"/>
+        <w:numPr>
+          <w:ilvl w:val="0"/>
+          <w:numId w:val="1"/>
+        </w:numPr>
+        <w:rPr>
+          <w:sz w:val="20"/>
+          <w:szCs w:val="20"/>
+          <w:lang w:val="es-419"/>
+        </w:rPr>
+      </w:pPr>
+      <w:r>
+        <w:rPr>
+          <w:sz w:val="20"/>
+          <w:szCs w:val="20"/>
+          <w:lang w:val="es-419"/>
+        </w:rPr>
+        <w:t xml:space="preserve">Mejorar </w:t>
+      </w:r>
+      <w:proofErr w:type="spellStart"/>
+      <w:r>
+        <w:rPr>
+          <w:sz w:val="20"/>
+          <w:szCs w:val="20"/>
+          <w:lang w:val="es-419"/>
+        </w:rPr>
+        <w:t>estetica</w:t>
+      </w:r>
+      <w:proofErr w:type="spellEnd"/>
+      <w:r>
+        <w:rPr>
+          <w:sz w:val="20"/>
+          <w:szCs w:val="20"/>
+          <w:lang w:val="es-419"/>
+        </w:rPr>
+        <w:t xml:space="preserve"> del carrito, elementos muy pegados entre </w:t>
+      </w:r>
+      <w:proofErr w:type="spellStart"/>
+      <w:r>
+        <w:rPr>
+          <w:sz w:val="20"/>
+          <w:szCs w:val="20"/>
+          <w:lang w:val="es-419"/>
+        </w:rPr>
+        <w:t>si</w:t>
+      </w:r>
+      <w:proofErr w:type="spellEnd"/>
+      <w:r>
+        <w:rPr>
+          <w:sz w:val="20"/>
+          <w:szCs w:val="20"/>
+          <w:lang w:val="es-419"/>
+        </w:rPr>
+        <w:t>,</w:t>
+      </w:r>
+    </w:p>
+    <w:p>
+      <w:pPr>
+        <w:pStyle w:val="Prrafodelista"/>
+        <w:numPr>
+          <w:ilvl w:val="0"/>
+          <w:numId w:val="1"/>
+        </w:numPr>
+        <w:rPr>
+          <w:sz w:val="20"/>
+          <w:szCs w:val="20"/>
+          <w:lang w:val="es-419"/>
+        </w:rPr>
+      </w:pPr>
+      <w:r>
+        <w:rPr>
+          <w:sz w:val="20"/>
+          <w:szCs w:val="20"/>
+          <w:lang w:val="es-419"/>
+        </w:rPr>
+        <w:t xml:space="preserve">Ajustar </w:t>
+      </w:r>
+      <w:proofErr w:type="spellStart"/>
+      <w:r>
+        <w:rPr>
+          <w:sz w:val="20"/>
+          <w:szCs w:val="20"/>
+          <w:lang w:val="es-419"/>
+        </w:rPr>
+        <w:t>boton</w:t>
+      </w:r>
+      <w:proofErr w:type="spellEnd"/>
+      <w:r>
+        <w:rPr>
+          <w:sz w:val="20"/>
+          <w:szCs w:val="20"/>
+          <w:lang w:val="es-419"/>
+        </w:rPr>
+        <w:t xml:space="preserve"> de volver al </w:t>
+      </w:r>
+      <w:proofErr w:type="spellStart"/>
+      <w:r>
+        <w:rPr>
+          <w:sz w:val="20"/>
+          <w:szCs w:val="20"/>
+          <w:lang w:val="es-419"/>
+        </w:rPr>
+        <w:t>menu</w:t>
+      </w:r>
+      <w:proofErr w:type="spellEnd"/>
+      <w:r>
+        <w:rPr>
+          <w:sz w:val="20"/>
+          <w:szCs w:val="20"/>
+          <w:lang w:val="es-419"/>
+        </w:rPr>
+        <w:t xml:space="preserve">, muy pegado al </w:t>
+      </w:r>
+      <w:proofErr w:type="spellStart"/>
+      <w:r>
+        <w:rPr>
+          <w:sz w:val="20"/>
+          <w:szCs w:val="20"/>
+          <w:lang w:val="es-419"/>
+        </w:rPr>
+        <w:t>header</w:t>
+      </w:r>
+      <w:proofErr w:type="spellEnd"/>
+      <w:r>
+        <w:rPr>
+          <w:sz w:val="20"/>
+          <w:szCs w:val="20"/>
+          <w:lang w:val="es-419"/>
+        </w:rPr>
+        <w:t>.</w:t>
+      </w:r>
+    </w:p>
+    <w:p>
+      <w:pPr>
+        <w:pStyle w:val="Prrafodelista"/>
+        <w:numPr>
+          <w:ilvl w:val="0"/>
+          <w:numId w:val="1"/>
+        </w:numPr>
+        <w:rPr>
+          <w:sz w:val="20"/>
+          <w:szCs w:val="20"/>
+          <w:lang w:val="es-419"/>
+        </w:rPr>
+      </w:pPr>
+      <w:r>
+        <w:rPr>
+          <w:sz w:val="20"/>
+          <w:szCs w:val="20"/>
+          <w:lang w:val="es-419"/>
+        </w:rPr>
+        <w:t xml:space="preserve">Que cuando agregues un elemento al carrito te mande de vuelta al </w:t>
+      </w:r>
+      <w:r>
+        <w:rPr>
+          <w:sz w:val="20"/>
+          <w:szCs w:val="20"/>
+          <w:lang w:val="es-419"/>
+        </w:rPr>
+        <w:t xml:space="preserve">menú. </w:t>
+      </w:r>
+      <w:proofErr w:type="gramStart"/>
+      <w:r>
+        <w:rPr>
+          <w:sz w:val="20"/>
+          <w:szCs w:val="20"/>
+          <w:lang w:val="es-419"/>
+        </w:rPr>
+        <w:t>”Seguir</w:t>
+      </w:r>
+      <w:proofErr w:type="gramEnd"/>
+      <w:r>
+        <w:rPr>
+          <w:sz w:val="20"/>
+          <w:szCs w:val="20"/>
+          <w:lang w:val="es-419"/>
+        </w:rPr>
+        <w:t xml:space="preserve"> comprando”. Y que en el </w:t>
+      </w:r>
+      <w:proofErr w:type="spellStart"/>
+      <w:r>
+        <w:rPr>
+          <w:sz w:val="20"/>
+          <w:szCs w:val="20"/>
+          <w:lang w:val="es-419"/>
+        </w:rPr>
+        <w:t>header</w:t>
+      </w:r>
+      <w:proofErr w:type="spellEnd"/>
+      <w:r>
+        <w:rPr>
+          <w:sz w:val="20"/>
+          <w:szCs w:val="20"/>
+          <w:lang w:val="es-419"/>
+        </w:rPr>
+        <w:t xml:space="preserve"> donde esta el carrito muestre el conteo.</w:t>
+      </w:r>
+    </w:p>
+    <w:p>
+      <w:pPr>
+        <w:pStyle w:val="Prrafodelista"/>
+        <w:numPr>
+          <w:ilvl w:val="0"/>
+          <w:numId w:val="1"/>
+        </w:numPr>
+        <w:rPr>
+          <w:sz w:val="20"/>
+          <w:szCs w:val="20"/>
+          <w:lang w:val="es-419"/>
+        </w:rPr>
+      </w:pPr>
+      <w:r>
+        <w:rPr>
+          <w:sz w:val="20"/>
+          <w:szCs w:val="20"/>
+          <w:lang w:val="es-419"/>
+        </w:rPr>
+        <w:t xml:space="preserve">Verificar validaciones de los formularios (login, </w:t>
+      </w:r>
+      <w:proofErr w:type="spellStart"/>
+      <w:r>
+        <w:rPr>
+          <w:sz w:val="20"/>
+          <w:szCs w:val="20"/>
+          <w:lang w:val="es-419"/>
+        </w:rPr>
+        <w:t>signin</w:t>
+      </w:r>
+      <w:proofErr w:type="spellEnd"/>
+      <w:r>
+        <w:rPr>
+          <w:sz w:val="20"/>
+          <w:szCs w:val="20"/>
+          <w:lang w:val="es-419"/>
+        </w:rPr>
+        <w:t xml:space="preserve">, confirmar pedido, </w:t>
+      </w:r>
+      <w:proofErr w:type="spellStart"/>
+      <w:r>
+        <w:rPr>
+          <w:sz w:val="20"/>
+          <w:szCs w:val="20"/>
+          <w:lang w:val="es-419"/>
+        </w:rPr>
+        <w:t>etc</w:t>
+      </w:r>
+      <w:proofErr w:type="spellEnd"/>
+      <w:r>
+        <w:rPr>
+          <w:sz w:val="20"/>
+          <w:szCs w:val="20"/>
+          <w:lang w:val="es-419"/>
+        </w:rPr>
+        <w:t xml:space="preserve">). </w:t>
+      </w:r>
+      <w:proofErr w:type="spellStart"/>
+      <w:r>
+        <w:rPr>
+          <w:sz w:val="20"/>
+          <w:szCs w:val="20"/>
+          <w:lang w:val="es-419"/>
+        </w:rPr>
+        <w:t>Estan</w:t>
+      </w:r>
+      <w:proofErr w:type="spellEnd"/>
+      <w:r>
+        <w:rPr>
+          <w:sz w:val="20"/>
+          <w:szCs w:val="20"/>
+          <w:lang w:val="es-419"/>
+        </w:rPr>
+        <w:t xml:space="preserve"> hechas en HTML, pasarlas a JS</w:t>
+      </w:r>
+      <w:r>
+        <w:rPr>
+          <w:sz w:val="20"/>
+          <w:szCs w:val="20"/>
+          <w:lang w:val="es-419"/>
+        </w:rPr>
+        <w:t>.</w:t>
+      </w:r>
+    </w:p>
+    <w:p>
+      <w:pPr>
+        <w:pStyle w:val="Prrafodelista"/>
+        <w:numPr>
+          <w:ilvl w:val="0"/>
+          <w:numId w:val="1"/>
+        </w:numPr>
+        <w:rPr>
+          <w:sz w:val="20"/>
+          <w:szCs w:val="20"/>
+          <w:lang w:val="es-419"/>
+        </w:rPr>
+      </w:pPr>
+      <w:r>
+        <w:rPr>
+          <w:sz w:val="20"/>
+          <w:szCs w:val="20"/>
+          <w:lang w:val="es-419"/>
+        </w:rPr>
+        <w:t xml:space="preserve">Tocar en salir solo cambia el </w:t>
+      </w:r>
+      <w:proofErr w:type="spellStart"/>
+      <w:r>
+        <w:rPr>
+          <w:sz w:val="20"/>
+          <w:szCs w:val="20"/>
+          <w:lang w:val="es-419"/>
+        </w:rPr>
+        <w:t>boton</w:t>
+      </w:r>
+      <w:proofErr w:type="spellEnd"/>
+      <w:r>
+        <w:rPr>
+          <w:sz w:val="20"/>
+          <w:szCs w:val="20"/>
+          <w:lang w:val="es-419"/>
+        </w:rPr>
+        <w:t xml:space="preserve"> de "Salir" a "registrarse"</w:t>
+      </w:r>
+      <w:r>
+        <w:rPr>
+          <w:sz w:val="20"/>
+          <w:szCs w:val="20"/>
+          <w:lang w:val="es-419"/>
+        </w:rPr>
+        <w:t>,</w:t>
+      </w:r>
+      <w:r>
+        <w:rPr>
+          <w:sz w:val="20"/>
+          <w:szCs w:val="20"/>
+          <w:lang w:val="es-419"/>
+        </w:rPr>
+        <w:t xml:space="preserve"> al estar </w:t>
+      </w:r>
+      <w:proofErr w:type="spellStart"/>
+      <w:r>
+        <w:rPr>
+          <w:sz w:val="20"/>
+          <w:szCs w:val="20"/>
+          <w:lang w:val="es-419"/>
+        </w:rPr>
+        <w:t>logeado</w:t>
+      </w:r>
+      <w:proofErr w:type="spellEnd"/>
+      <w:r>
+        <w:rPr>
+          <w:sz w:val="20"/>
+          <w:szCs w:val="20"/>
+          <w:lang w:val="es-419"/>
+        </w:rPr>
+        <w:t xml:space="preserve"> te muestre tu nombre</w:t>
+      </w:r>
+      <w:r>
+        <w:rPr>
+          <w:sz w:val="20"/>
+          <w:szCs w:val="20"/>
+          <w:lang w:val="es-419"/>
+        </w:rPr>
+        <w:t xml:space="preserve">. “Hola </w:t>
+      </w:r>
+      <w:proofErr w:type="spellStart"/>
+      <w:r>
+        <w:rPr>
+          <w:sz w:val="20"/>
+          <w:szCs w:val="20"/>
+          <w:lang w:val="es-419"/>
+        </w:rPr>
+        <w:t>Pepido</w:t>
+      </w:r>
+      <w:proofErr w:type="spellEnd"/>
+      <w:r>
+        <w:rPr>
+          <w:sz w:val="20"/>
+          <w:szCs w:val="20"/>
+          <w:lang w:val="es-419"/>
+        </w:rPr>
+        <w:t>”</w:t>
+      </w:r>
+    </w:p>
+    <w:p>
+      <w:pPr>
+        <w:pStyle w:val="Prrafodelista"/>
+        <w:numPr>
+          <w:ilvl w:val="0"/>
+          <w:numId w:val="1"/>
+        </w:numPr>
+        <w:rPr>
+          <w:sz w:val="20"/>
+          <w:szCs w:val="20"/>
+          <w:lang w:val="es-419"/>
+        </w:rPr>
+      </w:pPr>
+      <w:r>
+        <w:rPr>
+          <w:sz w:val="20"/>
+          <w:szCs w:val="20"/>
+          <w:lang w:val="es-419"/>
+        </w:rPr>
+        <w:t>Revisar asunto del token</w:t>
+      </w:r>
+    </w:p>
+    <w:p>
+      <w:pPr>
+        <w:pStyle w:val="Prrafodelista"/>
+        <w:numPr>
+          <w:ilvl w:val="0"/>
+          <w:numId w:val="1"/>
+        </w:numPr>
+        <w:rPr>
+          <w:sz w:val="20"/>
+          <w:szCs w:val="20"/>
+          <w:lang w:val="es-419"/>
+        </w:rPr>
+      </w:pPr>
+      <w:r>
+        <w:rPr>
+          <w:sz w:val="20"/>
+          <w:szCs w:val="20"/>
+          <w:lang w:val="es-419"/>
+        </w:rPr>
+        <w:t>Los adicionales que sean para la hamburguesa.</w:t>
+      </w:r>
+    </w:p>
+    <w:p>
+      <w:pPr>
+        <w:pStyle w:val="Prrafodelista"/>
+        <w:numPr>
+          <w:ilvl w:val="0"/>
+          <w:numId w:val="1"/>
+        </w:numPr>
+        <w:rPr>
+          <w:sz w:val="20"/>
+          <w:szCs w:val="20"/>
+          <w:lang w:val="es-419"/>
+        </w:rPr>
+      </w:pPr>
+      <w:r>
+        <w:rPr>
+          <w:sz w:val="20"/>
+          <w:szCs w:val="20"/>
+          <w:lang w:val="es-419"/>
+        </w:rPr>
+        <w:t xml:space="preserve">El menú </w:t>
+      </w:r>
+      <w:proofErr w:type="spellStart"/>
+      <w:r>
+        <w:rPr>
+          <w:sz w:val="20"/>
+          <w:szCs w:val="20"/>
+          <w:lang w:val="es-419"/>
+        </w:rPr>
+        <w:t>mobile</w:t>
+      </w:r>
+      <w:proofErr w:type="spellEnd"/>
+      <w:r>
+        <w:rPr>
+          <w:sz w:val="20"/>
+          <w:szCs w:val="20"/>
+          <w:lang w:val="es-419"/>
+        </w:rPr>
+        <w:t xml:space="preserve"> que sea </w:t>
+      </w:r>
+      <w:proofErr w:type="spellStart"/>
+      <w:r>
+        <w:rPr>
+          <w:sz w:val="20"/>
+          <w:szCs w:val="20"/>
+          <w:lang w:val="es-419"/>
+        </w:rPr>
+        <w:t>bottonbar</w:t>
+      </w:r>
+      <w:proofErr w:type="spellEnd"/>
+      <w:r>
+        <w:rPr>
+          <w:sz w:val="20"/>
+          <w:szCs w:val="20"/>
+          <w:lang w:val="es-419"/>
+        </w:rPr>
+        <w:t>.</w:t>
+      </w:r>
+    </w:p>
+    <w:p>
+      <w:pPr>
+        <w:pStyle w:val="Prrafodelista"/>
+        <w:rPr>
+          <w:sz w:val="20"/>
+          <w:szCs w:val="20"/>
+          <w:lang w:val="es-419"/>
+        </w:rPr>
+      </w:pPr>
+      <w:r>
+        <w:rPr>
+          <w:sz w:val="20"/>
+          <w:szCs w:val="20"/>
+          <w:lang w:val="es-419"/>
+        </w:rPr>
+        <w:br/>
+      </w:r>
     </w:p>
     <w:p>
       <w:pPr>
@@ -539,7 +1256,15 @@
             <w:tcW w:w="7315" w:type="dxa"/>
           </w:tcPr>
           <w:p>
-            <w:r>
+            <w:pPr>
+              <w:rPr>
+                <w:lang w:val="es-419"/>
+              </w:rPr>
+            </w:pPr>
+            <w:r>
+              <w:rPr>
+                <w:lang w:val="es-419"/>
+              </w:rPr>
               <w:t>Cambio de estado con fecha y hora</w:t>
             </w:r>
           </w:p>
@@ -627,7 +1352,15 @@
             <w:tcW w:w="7315" w:type="dxa"/>
           </w:tcPr>
           <w:p>
-            <w:r>
+            <w:pPr>
+              <w:rPr>
+                <w:lang w:val="es-419"/>
+              </w:rPr>
+            </w:pPr>
+            <w:r>
+              <w:rPr>
+                <w:lang w:val="es-419"/>
+              </w:rPr>
               <w:t>Cálculo de tiempo estimado de entrega</w:t>
             </w:r>
           </w:p>
@@ -693,9 +1426,25 @@
             <w:tcW w:w="7315" w:type="dxa"/>
           </w:tcPr>
           <w:p>
-            <w:r>
-              <w:t>Gestión de pedidos en backoffice</w:t>
-            </w:r>
+            <w:pPr>
+              <w:rPr>
+                <w:lang w:val="es-419"/>
+              </w:rPr>
+            </w:pPr>
+            <w:r>
+              <w:rPr>
+                <w:lang w:val="es-419"/>
+              </w:rPr>
+              <w:t xml:space="preserve">Gestión de pedidos en </w:t>
+            </w:r>
+            <w:proofErr w:type="spellStart"/>
+            <w:r>
+              <w:rPr>
+                <w:lang w:val="es-419"/>
+              </w:rPr>
+              <w:t>backoffice</w:t>
+            </w:r>
+            <w:proofErr w:type="spellEnd"/>
           </w:p>
         </w:tc>
       </w:tr>
@@ -711,6 +1460,10 @@
         </w:rPr>
       </w:pPr>
       <w:r>
+        <w:rPr>
+          <w:lang w:val="es-419"/>
+        </w:rPr>
+        <w:lastRenderedPageBreak/>
         <w:t>Historias de usuario</w:t>
       </w:r>
     </w:p>
@@ -723,6 +1476,9 @@
         </w:rPr>
       </w:pPr>
       <w:r>
+        <w:rPr>
+          <w:lang w:val="es-419"/>
+        </w:rPr>
         <w:t>HU-09: Como cliente, quiero ver mis pedidos anteriores con detalle, importe, fecha y estado, para saber qué pedí y cómo terminó.</w:t>
       </w:r>
     </w:p>
@@ -735,6 +1491,9 @@
         </w:rPr>
       </w:pPr>
       <w:r>
+        <w:rPr>
+          <w:lang w:val="es-419"/>
+        </w:rPr>
         <w:t>HU-10: Como cliente, quiero ver cómo evoluciona mi pedido, para saber quién lo prepara, en qué está y cuándo llega.</w:t>
       </w:r>
     </w:p>
@@ -747,6 +1506,9 @@
         </w:rPr>
       </w:pPr>
       <w:r>
+        <w:rPr>
+          <w:lang w:val="es-419"/>
+        </w:rPr>
         <w:t>HU-11: Como cliente, quiero cancelar un pedido que todavía no empezó a prepararse, para no recibirlo si me arrepentí.</w:t>
       </w:r>
     </w:p>
@@ -759,6 +1521,9 @@
         </w:rPr>
       </w:pPr>
       <w:r>
+        <w:rPr>
+          <w:lang w:val="es-419"/>
+        </w:rPr>
         <w:t>HU-12: Como cliente, quiero repetir un pedido anterior, para no armar el carrito de nuevo.</w:t>
       </w:r>
     </w:p>
@@ -771,6 +1536,9 @@
         </w:rPr>
       </w:pPr>
       <w:r>
+        <w:rPr>
+          <w:lang w:val="es-419"/>
+        </w:rPr>
         <w:t>HU-13: Como administrador, quiero ver los pedidos y cambiar su estado, para llevar cada uno hasta la entrega.</w:t>
       </w:r>
     </w:p>
@@ -782,7 +1550,6 @@
           <w:lang w:val="es-419"/>
         </w:rPr>
       </w:pPr>
-      <w:r/>
     </w:p>
     <w:p>
       <w:pPr>
@@ -792,7 +1559,6 @@
           <w:lang w:val="es-419"/>
         </w:rPr>
       </w:pPr>
-      <w:r/>
     </w:p>
     <w:sectPr>
       <w:pgSz w:w="11906" w:h="16838"/>
@@ -802,6 +1568,126 @@
     </w:sectPr>
   </w:body>
 </w:document>
+</file>
+
+<file path=word/numbering.xml><?xml version="1.0" encoding="utf-8"?>
+<w:numbering xmlns:wpc="http://schemas.microsoft.com/office/word/2010/wordprocessingCanvas" xmlns:cx="http://schemas.microsoft.com/office/drawing/2014/chartex" xmlns:cx1="http://schemas.microsoft.com/office/drawing/2015/9/8/chartex" xmlns:cx2="http://schemas.microsoft.com/office/drawing/2015/10/21/chartex" xmlns:cx3="http://schemas.microsoft.com/office/drawing/2016/5/9/chartex" xmlns:cx4="http://schemas.microsoft.com/office/drawing/2016/5/10/chartex" xmlns:cx5="http://schemas.microsoft.com/office/drawing/2016/5/11/chartex" xmlns:cx6="http://schemas.microsoft.com/office/drawing/2016/5/12/chartex" xmlns:cx7="http://schemas.microsoft.com/office/drawing/2016/5/13/chartex" xmlns:cx8="http://schemas.microsoft.com/office/drawing/2016/5/14/chartex" xmlns:mc="http://schemas.openxmlformats.org/markup-compatibility/2006" xmlns:aink="http://schemas.microsoft.com/office/drawing/2016/ink" xmlns:am3d="http://schemas.microsoft.com/office/drawing/2017/model3d" xmlns:o="urn:schemas-microsoft-com:office:office" xmlns:oel="http://schemas.microsoft.com/office/2019/extlst" xmlns:r="http://schemas.openxmlformats.org/officeDocument/2006/relationships" xmlns:m="http://schemas.openxmlformats.org/officeDocument/2006/math" xmlns:v="urn:schemas-microsoft-com:vml" xmlns:wp14="http://schemas.microsoft.com/office/word/2010/wordprocessingDrawing" xmlns:wp="http://schemas.openxmlformats.org/drawingml/2006/wordprocessingDrawing" xmlns:w10="urn:schemas-microsoft-com:office:word" xmlns:w="http://schemas.openxmlformats.org/wordprocessingml/2006/main" xmlns:w14="http://schemas.microsoft.com/office/word/2010/wordml" xmlns:w15="http://schemas.microsoft.com/office/word/2012/wordml" xmlns:w16cex="http://schemas.microsoft.com/office/word/2018/wordml/cex" xmlns:w16cid="http://schemas.microsoft.com/office/word/2016/wordml/cid" xmlns:w16="http://schemas.microsoft.com/office/word/2018/wordml" xmlns:w16du="http://schemas.microsoft.com/office/word/2023/wordml/word16du" xmlns:w16sdtdh="http://schemas.microsoft.com/office/word/2020/wordml/sdtdatahash" xmlns:w16sdtfl="http://schemas.microsoft.com/office/word/2024/wordml/sdtformatlock" xmlns:w16se="http://schemas.microsoft.com/office/word/2015/wordml/symex" xmlns:wpg="http://schemas.microsoft.com/office/word/2010/wordprocessingGroup" xmlns:wpi="http://schemas.microsoft.com/office/word/2010/wordprocessingInk" xmlns:wne="http://schemas.microsoft.com/office/word/2006/wordml" xmlns:wps="http://schemas.microsoft.com/office/word/2010/wordprocessingShape" mc:Ignorable="w14 w15 w16se w16cid w16 w16cex w16sdtdh w16sdtfl w16du wp14">
+  <w:abstractNum w:abstractNumId="0" w15:restartNumberingAfterBreak="0">
+    <w:nsid w:val="05385543"/>
+    <w:multiLevelType w:val="hybridMultilevel"/>
+    <w:tmpl w:val="23A025CC"/>
+    <w:lvl w:ilvl="0" w:tplc="6778F588">
+      <w:numFmt w:val="bullet"/>
+      <w:lvlText w:val="-"/>
+      <w:lvlJc w:val="left"/>
+      <w:pPr>
+        <w:ind w:left="720" w:hanging="360"/>
+      </w:pPr>
+      <w:rPr>
+        <w:rFonts w:ascii="Arial" w:eastAsia="Arial" w:hAnsi="Arial" w:cs="Arial" w:hint="default"/>
+      </w:rPr>
+    </w:lvl>
+    <w:lvl w:ilvl="1" w:tplc="580A0003" w:tentative="1">
+      <w:start w:val="1"/>
+      <w:numFmt w:val="bullet"/>
+      <w:lvlText w:val="o"/>
+      <w:lvlJc w:val="left"/>
+      <w:pPr>
+        <w:ind w:left="1440" w:hanging="360"/>
+      </w:pPr>
+      <w:rPr>
+        <w:rFonts w:ascii="Courier New" w:hAnsi="Courier New" w:cs="Courier New" w:hint="default"/>
+      </w:rPr>
+    </w:lvl>
+    <w:lvl w:ilvl="2" w:tplc="580A0005" w:tentative="1">
+      <w:start w:val="1"/>
+      <w:numFmt w:val="bullet"/>
+      <w:lvlText w:val=""/>
+      <w:lvlJc w:val="left"/>
+      <w:pPr>
+        <w:ind w:left="2160" w:hanging="360"/>
+      </w:pPr>
+      <w:rPr>
+        <w:rFonts w:ascii="Wingdings" w:hAnsi="Wingdings" w:hint="default"/>
+      </w:rPr>
+    </w:lvl>
+    <w:lvl w:ilvl="3" w:tplc="580A0001" w:tentative="1">
+      <w:start w:val="1"/>
+      <w:numFmt w:val="bullet"/>
+      <w:lvlText w:val=""/>
+      <w:lvlJc w:val="left"/>
+      <w:pPr>
+        <w:ind w:left="2880" w:hanging="360"/>
+      </w:pPr>
+      <w:rPr>
+        <w:rFonts w:ascii="Symbol" w:hAnsi="Symbol" w:hint="default"/>
+      </w:rPr>
+    </w:lvl>
+    <w:lvl w:ilvl="4" w:tplc="580A0003" w:tentative="1">
+      <w:start w:val="1"/>
+      <w:numFmt w:val="bullet"/>
+      <w:lvlText w:val="o"/>
+      <w:lvlJc w:val="left"/>
+      <w:pPr>
+        <w:ind w:left="3600" w:hanging="360"/>
+      </w:pPr>
+      <w:rPr>
+        <w:rFonts w:ascii="Courier New" w:hAnsi="Courier New" w:cs="Courier New" w:hint="default"/>
+      </w:rPr>
+    </w:lvl>
+    <w:lvl w:ilvl="5" w:tplc="580A0005" w:tentative="1">
+      <w:start w:val="1"/>
+      <w:numFmt w:val="bullet"/>
+      <w:lvlText w:val=""/>
+      <w:lvlJc w:val="left"/>
+      <w:pPr>
+        <w:ind w:left="4320" w:hanging="360"/>
+      </w:pPr>
+      <w:rPr>
+        <w:rFonts w:ascii="Wingdings" w:hAnsi="Wingdings" w:hint="default"/>
+      </w:rPr>
+    </w:lvl>
+    <w:lvl w:ilvl="6" w:tplc="580A0001" w:tentative="1">
+      <w:start w:val="1"/>
+      <w:numFmt w:val="bullet"/>
+      <w:lvlText w:val=""/>
+      <w:lvlJc w:val="left"/>
+      <w:pPr>
+        <w:ind w:left="5040" w:hanging="360"/>
+      </w:pPr>
+      <w:rPr>
+        <w:rFonts w:ascii="Symbol" w:hAnsi="Symbol" w:hint="default"/>
+      </w:rPr>
+    </w:lvl>
+    <w:lvl w:ilvl="7" w:tplc="580A0003" w:tentative="1">
+      <w:start w:val="1"/>
+      <w:numFmt w:val="bullet"/>
+      <w:lvlText w:val="o"/>
+      <w:lvlJc w:val="left"/>
+      <w:pPr>
+        <w:ind w:left="5760" w:hanging="360"/>
+      </w:pPr>
+      <w:rPr>
+        <w:rFonts w:ascii="Courier New" w:hAnsi="Courier New" w:cs="Courier New" w:hint="default"/>
+      </w:rPr>
+    </w:lvl>
+    <w:lvl w:ilvl="8" w:tplc="580A0005" w:tentative="1">
+      <w:start w:val="1"/>
+      <w:numFmt w:val="bullet"/>
+      <w:lvlText w:val=""/>
+      <w:lvlJc w:val="left"/>
+      <w:pPr>
+        <w:ind w:left="6480" w:hanging="360"/>
+      </w:pPr>
+      <w:rPr>
+        <w:rFonts w:ascii="Wingdings" w:hAnsi="Wingdings" w:hint="default"/>
+      </w:rPr>
+    </w:lvl>
+  </w:abstractNum>
+  <w:num w:numId="1" w16cid:durableId="1271083045">
+    <w:abstractNumId w:val="0"/>
+  </w:num>
+</w:numbering>
 </file>
 
 <file path=word/styles.xml><?xml version="1.0" encoding="utf-8"?>
@@ -1400,6 +2286,17 @@
       <w:tblStyleColBandSize w:val="1"/>
     </w:tblPr>
   </w:style>
+  <w:style w:type="paragraph" w:styleId="Prrafodelista">
+    <w:name w:val="List Paragraph"/>
+    <w:basedOn w:val="Normal"/>
+    <w:uiPriority w:val="34"/>
+    <w:qFormat/>
+    <w:rsid w:val="00B557B2"/>
+    <w:pPr>
+      <w:ind w:left="720"/>
+      <w:contextualSpacing/>
+    </w:pPr>
+  </w:style>
 </w:styles>
 </file>
 

</xml_diff>